<commit_message>
Mise à jour du dossier analyse et conception de la phase 1
</commit_message>
<xml_diff>
--- a/project/Documentation Projet/Phase 1 Définir la structure de la base de donées/Phase 1 Dossier analyse et conception.docx
+++ b/project/Documentation Projet/Phase 1 Définir la structure de la base de donées/Phase 1 Dossier analyse et conception.docx
@@ -91,6 +91,9 @@
       <w:r>
         <w:t>Le nom donné au tournois doit être unique tous comme le mot de passe afin de ne pas avoir de doublon.</w:t>
       </w:r>
+      <w:r>
+        <w:t xml:space="preserve"> </w:t>
+      </w:r>
     </w:p>
     <w:p>
       <w:pPr>
@@ -101,6 +104,45 @@
       </w:r>
     </w:p>
     <w:p>
+      <w:r>
+        <w:drawing>
+          <wp:inline distT="0" distB="0" distL="0" distR="0" wp14:anchorId="17B24D0C" wp14:editId="7E1EC8D6">
+            <wp:extent cx="5760720" cy="1399540"/>
+            <wp:effectExtent l="0" t="0" r="0" b="0"/>
+            <wp:docPr id="34241641" name="Image 1" descr="Une image contenant texte, ligne, Police, Tracé&#10;&#10;Le contenu généré par l’IA peut être incorrect."/>
+            <wp:cNvGraphicFramePr>
+              <a:graphicFrameLocks xmlns:a="http://schemas.openxmlformats.org/drawingml/2006/main" noChangeAspect="1"/>
+            </wp:cNvGraphicFramePr>
+            <a:graphic xmlns:a="http://schemas.openxmlformats.org/drawingml/2006/main">
+              <a:graphicData uri="http://schemas.openxmlformats.org/drawingml/2006/picture">
+                <pic:pic xmlns:pic="http://schemas.openxmlformats.org/drawingml/2006/picture">
+                  <pic:nvPicPr>
+                    <pic:cNvPr id="34241641" name="Image 1" descr="Une image contenant texte, ligne, Police, Tracé&#10;&#10;Le contenu généré par l’IA peut être incorrect."/>
+                    <pic:cNvPicPr/>
+                  </pic:nvPicPr>
+                  <pic:blipFill>
+                    <a:blip r:embed="rId5"/>
+                    <a:stretch>
+                      <a:fillRect/>
+                    </a:stretch>
+                  </pic:blipFill>
+                  <pic:spPr>
+                    <a:xfrm>
+                      <a:off x="0" y="0"/>
+                      <a:ext cx="5760720" cy="1399540"/>
+                    </a:xfrm>
+                    <a:prstGeom prst="rect">
+                      <a:avLst/>
+                    </a:prstGeom>
+                  </pic:spPr>
+                </pic:pic>
+              </a:graphicData>
+            </a:graphic>
+          </wp:inline>
+        </w:drawing>
+      </w:r>
+    </w:p>
+    <w:p>
       <w:pPr>
         <w:pStyle w:val="Titre3"/>
       </w:pPr>
@@ -108,6 +150,7 @@
         <w:t>Architecture logicielle et matérielle</w:t>
       </w:r>
     </w:p>
+    <w:p/>
     <w:p>
       <w:pPr>
         <w:pStyle w:val="Titre3"/>
@@ -116,7 +159,110 @@
         <w:t>Interface utilisateur : Maquettes des écrans, Navigation entre les pages</w:t>
       </w:r>
     </w:p>
+    <w:p>
+      <w:pPr>
+        <w:pStyle w:val="Titre2"/>
+        <w:numPr>
+          <w:ilvl w:val="0"/>
+          <w:numId w:val="3"/>
+        </w:numPr>
+      </w:pPr>
+      <w:proofErr w:type="spellStart"/>
+      <w:r>
+        <w:t>TournamentName</w:t>
+      </w:r>
+      <w:r>
+        <w:t>Database</w:t>
+      </w:r>
+      <w:proofErr w:type="spellEnd"/>
+    </w:p>
     <w:p/>
+    <w:p>
+      <w:pPr>
+        <w:pStyle w:val="Titre3"/>
+      </w:pPr>
+      <w:r>
+        <w:t>Identification des utilisateurs</w:t>
+      </w:r>
+    </w:p>
+    <w:p/>
+    <w:p>
+      <w:pPr>
+        <w:pStyle w:val="Titre3"/>
+      </w:pPr>
+      <w:r>
+        <w:t>Cas d’usage</w:t>
+      </w:r>
+    </w:p>
+    <w:p>
+      <w:r>
+        <w:t>Cette table est propre à chaque tournoi et s’adapte en fonction de la demande de l’organisateur. Elle est générée par un script python pour chaque tournoi. Elle contient toutes les informations nécessaires au déroulement du tournoi.</w:t>
+      </w:r>
+    </w:p>
+    <w:p>
+      <w:pPr>
+        <w:pStyle w:val="Titre3"/>
+      </w:pPr>
+      <w:r>
+        <w:lastRenderedPageBreak/>
+        <w:t>Contraintes techniques et fonctionnelles</w:t>
+      </w:r>
+    </w:p>
+    <w:p>
+      <w:pPr>
+        <w:pStyle w:val="Titre3"/>
+      </w:pPr>
+      <w:r>
+        <w:t>Schéma de la base de données</w:t>
+      </w:r>
+    </w:p>
+    <w:p>
+      <w:r>
+        <w:drawing>
+          <wp:inline distT="0" distB="0" distL="0" distR="0" wp14:anchorId="1F00D102" wp14:editId="01C4EEA1">
+            <wp:extent cx="5760720" cy="3268345"/>
+            <wp:effectExtent l="0" t="0" r="0" b="8255"/>
+            <wp:docPr id="1709527135" name="Image 1" descr="Une image contenant texte, diagramme, Police, ligne&#10;&#10;Le contenu généré par l’IA peut être incorrect."/>
+            <wp:cNvGraphicFramePr>
+              <a:graphicFrameLocks xmlns:a="http://schemas.openxmlformats.org/drawingml/2006/main" noChangeAspect="1"/>
+            </wp:cNvGraphicFramePr>
+            <a:graphic xmlns:a="http://schemas.openxmlformats.org/drawingml/2006/main">
+              <a:graphicData uri="http://schemas.openxmlformats.org/drawingml/2006/picture">
+                <pic:pic xmlns:pic="http://schemas.openxmlformats.org/drawingml/2006/picture">
+                  <pic:nvPicPr>
+                    <pic:cNvPr id="1709527135" name="Image 1" descr="Une image contenant texte, diagramme, Police, ligne&#10;&#10;Le contenu généré par l’IA peut être incorrect."/>
+                    <pic:cNvPicPr/>
+                  </pic:nvPicPr>
+                  <pic:blipFill>
+                    <a:blip r:embed="rId6"/>
+                    <a:stretch>
+                      <a:fillRect/>
+                    </a:stretch>
+                  </pic:blipFill>
+                  <pic:spPr>
+                    <a:xfrm>
+                      <a:off x="0" y="0"/>
+                      <a:ext cx="5760720" cy="3268345"/>
+                    </a:xfrm>
+                    <a:prstGeom prst="rect">
+                      <a:avLst/>
+                    </a:prstGeom>
+                  </pic:spPr>
+                </pic:pic>
+              </a:graphicData>
+            </a:graphic>
+          </wp:inline>
+        </w:drawing>
+      </w:r>
+    </w:p>
+    <w:p>
+      <w:pPr>
+        <w:pStyle w:val="Titre3"/>
+      </w:pPr>
+      <w:r>
+        <w:t>Architecture logicielle et matérielle</w:t>
+      </w:r>
+    </w:p>
     <w:sectPr>
       <w:pgSz w:w="11906" w:h="16838"/>
       <w:pgMar w:top="1417" w:right="1417" w:bottom="1417" w:left="1417" w:header="708" w:footer="708" w:gutter="0"/>
@@ -242,6 +388,95 @@
     </w:lvl>
   </w:abstractNum>
   <w:abstractNum w:abstractNumId="1" w15:restartNumberingAfterBreak="0">
+    <w:nsid w:val="198959E0"/>
+    <w:multiLevelType w:val="hybridMultilevel"/>
+    <w:tmpl w:val="C2888B2A"/>
+    <w:lvl w:ilvl="0" w:tplc="220C9014">
+      <w:start w:val="1"/>
+      <w:numFmt w:val="upperRoman"/>
+      <w:lvlText w:val="%1-"/>
+      <w:lvlJc w:val="left"/>
+      <w:pPr>
+        <w:ind w:left="1080" w:hanging="720"/>
+      </w:pPr>
+      <w:rPr>
+        <w:rFonts w:hint="default"/>
+      </w:rPr>
+    </w:lvl>
+    <w:lvl w:ilvl="1" w:tplc="040C0019" w:tentative="1">
+      <w:start w:val="1"/>
+      <w:numFmt w:val="lowerLetter"/>
+      <w:lvlText w:val="%2."/>
+      <w:lvlJc w:val="left"/>
+      <w:pPr>
+        <w:ind w:left="1440" w:hanging="360"/>
+      </w:pPr>
+    </w:lvl>
+    <w:lvl w:ilvl="2" w:tplc="040C001B" w:tentative="1">
+      <w:start w:val="1"/>
+      <w:numFmt w:val="lowerRoman"/>
+      <w:lvlText w:val="%3."/>
+      <w:lvlJc w:val="right"/>
+      <w:pPr>
+        <w:ind w:left="2160" w:hanging="180"/>
+      </w:pPr>
+    </w:lvl>
+    <w:lvl w:ilvl="3" w:tplc="040C000F" w:tentative="1">
+      <w:start w:val="1"/>
+      <w:numFmt w:val="decimal"/>
+      <w:lvlText w:val="%4."/>
+      <w:lvlJc w:val="left"/>
+      <w:pPr>
+        <w:ind w:left="2880" w:hanging="360"/>
+      </w:pPr>
+    </w:lvl>
+    <w:lvl w:ilvl="4" w:tplc="040C0019" w:tentative="1">
+      <w:start w:val="1"/>
+      <w:numFmt w:val="lowerLetter"/>
+      <w:lvlText w:val="%5."/>
+      <w:lvlJc w:val="left"/>
+      <w:pPr>
+        <w:ind w:left="3600" w:hanging="360"/>
+      </w:pPr>
+    </w:lvl>
+    <w:lvl w:ilvl="5" w:tplc="040C001B" w:tentative="1">
+      <w:start w:val="1"/>
+      <w:numFmt w:val="lowerRoman"/>
+      <w:lvlText w:val="%6."/>
+      <w:lvlJc w:val="right"/>
+      <w:pPr>
+        <w:ind w:left="4320" w:hanging="180"/>
+      </w:pPr>
+    </w:lvl>
+    <w:lvl w:ilvl="6" w:tplc="040C000F" w:tentative="1">
+      <w:start w:val="1"/>
+      <w:numFmt w:val="decimal"/>
+      <w:lvlText w:val="%7."/>
+      <w:lvlJc w:val="left"/>
+      <w:pPr>
+        <w:ind w:left="5040" w:hanging="360"/>
+      </w:pPr>
+    </w:lvl>
+    <w:lvl w:ilvl="7" w:tplc="040C0019" w:tentative="1">
+      <w:start w:val="1"/>
+      <w:numFmt w:val="lowerLetter"/>
+      <w:lvlText w:val="%8."/>
+      <w:lvlJc w:val="left"/>
+      <w:pPr>
+        <w:ind w:left="5760" w:hanging="360"/>
+      </w:pPr>
+    </w:lvl>
+    <w:lvl w:ilvl="8" w:tplc="040C001B" w:tentative="1">
+      <w:start w:val="1"/>
+      <w:numFmt w:val="lowerRoman"/>
+      <w:lvlText w:val="%9."/>
+      <w:lvlJc w:val="right"/>
+      <w:pPr>
+        <w:ind w:left="6480" w:hanging="180"/>
+      </w:pPr>
+    </w:lvl>
+  </w:abstractNum>
+  <w:abstractNum w:abstractNumId="2" w15:restartNumberingAfterBreak="0">
     <w:nsid w:val="1B49780C"/>
     <w:multiLevelType w:val="hybridMultilevel"/>
     <w:tmpl w:val="38801420"/>
@@ -330,7 +565,7 @@
       </w:pPr>
     </w:lvl>
   </w:abstractNum>
-  <w:abstractNum w:abstractNumId="2" w15:restartNumberingAfterBreak="0">
+  <w:abstractNum w:abstractNumId="3" w15:restartNumberingAfterBreak="0">
     <w:nsid w:val="44041268"/>
     <w:multiLevelType w:val="hybridMultilevel"/>
     <w:tmpl w:val="81B8114C"/>
@@ -443,12 +678,15 @@
     </w:lvl>
   </w:abstractNum>
   <w:num w:numId="1" w16cid:durableId="501550486">
-    <w:abstractNumId w:val="2"/>
+    <w:abstractNumId w:val="3"/>
   </w:num>
   <w:num w:numId="2" w16cid:durableId="1475102800">
     <w:abstractNumId w:val="0"/>
   </w:num>
   <w:num w:numId="3" w16cid:durableId="540093045">
+    <w:abstractNumId w:val="2"/>
+  </w:num>
+  <w:num w:numId="4" w16cid:durableId="2043703710">
     <w:abstractNumId w:val="1"/>
   </w:num>
 </w:numbering>

</xml_diff>

<commit_message>
Modification du dossier analyse et conception de la phase 1
</commit_message>
<xml_diff>
--- a/project/Documentation Projet/Phase 1 Définir la structure de la base de donées/Phase 1 Dossier analyse et conception.docx
+++ b/project/Documentation Projet/Phase 1 Définir la structure de la base de donées/Phase 1 Dossier analyse et conception.docx
@@ -60,10 +60,7 @@
     </w:p>
     <w:p>
       <w:r>
-        <w:t>Base</w:t>
-      </w:r>
-      <w:r>
-        <w:t xml:space="preserve"> de données qui gère l’identification des différents tournois en cours et qui permet à l’utilisateur de se connecter.</w:t>
+        <w:t>Utilisée par le script python afin de faire le lien entre l’utilisateur derrière son écran et la base de données associé au tournoi.</w:t>
       </w:r>
     </w:p>
     <w:p>
@@ -76,7 +73,7 @@
     </w:p>
     <w:p>
       <w:r>
-        <w:t>Permet à l’utilisateur de se connecter</w:t>
+        <w:t>Base de données qui gère l’identification des différents tournois en cours et qui permet à l’utilisateur de se connecter.</w:t>
       </w:r>
     </w:p>
     <w:p>
@@ -96,6 +93,16 @@
       </w:r>
     </w:p>
     <w:p>
+      <w:r>
+        <w:t xml:space="preserve">Langage : </w:t>
+      </w:r>
+      <w:proofErr w:type="spellStart"/>
+      <w:r>
+        <w:t>sqlLite</w:t>
+      </w:r>
+      <w:proofErr w:type="spellEnd"/>
+    </w:p>
+    <w:p>
       <w:pPr>
         <w:pStyle w:val="Titre3"/>
       </w:pPr>
@@ -105,11 +112,14 @@
     </w:p>
     <w:p>
       <w:r>
+        <w:rPr>
+          <w:noProof/>
+        </w:rPr>
         <w:drawing>
-          <wp:inline distT="0" distB="0" distL="0" distR="0" wp14:anchorId="17B24D0C" wp14:editId="7E1EC8D6">
-            <wp:extent cx="5760720" cy="1399540"/>
-            <wp:effectExtent l="0" t="0" r="0" b="0"/>
-            <wp:docPr id="34241641" name="Image 1" descr="Une image contenant texte, ligne, Police, Tracé&#10;&#10;Le contenu généré par l’IA peut être incorrect."/>
+          <wp:inline distT="0" distB="0" distL="0" distR="0" wp14:anchorId="27EA30C5" wp14:editId="1E547165">
+            <wp:extent cx="5760720" cy="1329055"/>
+            <wp:effectExtent l="0" t="0" r="0" b="4445"/>
+            <wp:docPr id="1210659710" name="Image 1"/>
             <wp:cNvGraphicFramePr>
               <a:graphicFrameLocks xmlns:a="http://schemas.openxmlformats.org/drawingml/2006/main" noChangeAspect="1"/>
             </wp:cNvGraphicFramePr>
@@ -117,7 +127,7 @@
               <a:graphicData uri="http://schemas.openxmlformats.org/drawingml/2006/picture">
                 <pic:pic xmlns:pic="http://schemas.openxmlformats.org/drawingml/2006/picture">
                   <pic:nvPicPr>
-                    <pic:cNvPr id="34241641" name="Image 1" descr="Une image contenant texte, ligne, Police, Tracé&#10;&#10;Le contenu généré par l’IA peut être incorrect."/>
+                    <pic:cNvPr id="1210659710" name=""/>
                     <pic:cNvPicPr/>
                   </pic:nvPicPr>
                   <pic:blipFill>
@@ -129,7 +139,7 @@
                   <pic:spPr>
                     <a:xfrm>
                       <a:off x="0" y="0"/>
-                      <a:ext cx="5760720" cy="1399540"/>
+                      <a:ext cx="5760720" cy="1329055"/>
                     </a:xfrm>
                     <a:prstGeom prst="rect">
                       <a:avLst/>
@@ -150,15 +160,54 @@
         <w:t>Architecture logicielle et matérielle</w:t>
       </w:r>
     </w:p>
+    <w:p>
+      <w:r>
+        <w:drawing>
+          <wp:inline distT="0" distB="0" distL="0" distR="0" wp14:anchorId="271E1414" wp14:editId="7E0C5A40">
+            <wp:extent cx="2996419" cy="1178647"/>
+            <wp:effectExtent l="0" t="0" r="0" b="2540"/>
+            <wp:docPr id="890583949" name="Image 1" descr="Une image contenant texte, Police, capture d’écran, blanc&#10;&#10;Le contenu généré par l’IA peut être incorrect."/>
+            <wp:cNvGraphicFramePr>
+              <a:graphicFrameLocks xmlns:a="http://schemas.openxmlformats.org/drawingml/2006/main" noChangeAspect="1"/>
+            </wp:cNvGraphicFramePr>
+            <a:graphic xmlns:a="http://schemas.openxmlformats.org/drawingml/2006/main">
+              <a:graphicData uri="http://schemas.openxmlformats.org/drawingml/2006/picture">
+                <pic:pic xmlns:pic="http://schemas.openxmlformats.org/drawingml/2006/picture">
+                  <pic:nvPicPr>
+                    <pic:cNvPr id="890583949" name="Image 1" descr="Une image contenant texte, Police, capture d’écran, blanc&#10;&#10;Le contenu généré par l’IA peut être incorrect."/>
+                    <pic:cNvPicPr/>
+                  </pic:nvPicPr>
+                  <pic:blipFill>
+                    <a:blip r:embed="rId6"/>
+                    <a:stretch>
+                      <a:fillRect/>
+                    </a:stretch>
+                  </pic:blipFill>
+                  <pic:spPr>
+                    <a:xfrm>
+                      <a:off x="0" y="0"/>
+                      <a:ext cx="3002532" cy="1181052"/>
+                    </a:xfrm>
+                    <a:prstGeom prst="rect">
+                      <a:avLst/>
+                    </a:prstGeom>
+                  </pic:spPr>
+                </pic:pic>
+              </a:graphicData>
+            </a:graphic>
+          </wp:inline>
+        </w:drawing>
+      </w:r>
+    </w:p>
+    <w:p>
+      <w:pPr>
+        <w:pStyle w:val="Titre3"/>
+      </w:pPr>
+      <w:r>
+        <w:t>Interface utilisateur : Maquettes des écrans, Navigation entre les pages</w:t>
+      </w:r>
+    </w:p>
     <w:p/>
-    <w:p>
-      <w:pPr>
-        <w:pStyle w:val="Titre3"/>
-      </w:pPr>
-      <w:r>
-        <w:t>Interface utilisateur : Maquettes des écrans, Navigation entre les pages</w:t>
-      </w:r>
-    </w:p>
     <w:p>
       <w:pPr>
         <w:pStyle w:val="Titre2"/>
@@ -182,10 +231,15 @@
         <w:pStyle w:val="Titre3"/>
       </w:pPr>
       <w:r>
+        <w:lastRenderedPageBreak/>
         <w:t>Identification des utilisateurs</w:t>
       </w:r>
     </w:p>
-    <w:p/>
+    <w:p>
+      <w:r>
+        <w:t>Utilisée par le script python afin de stocker les données du tournoi.</w:t>
+      </w:r>
+    </w:p>
     <w:p>
       <w:pPr>
         <w:pStyle w:val="Titre3"/>
@@ -196,7 +250,13 @@
     </w:p>
     <w:p>
       <w:r>
-        <w:t>Cette table est propre à chaque tournoi et s’adapte en fonction de la demande de l’organisateur. Elle est générée par un script python pour chaque tournoi. Elle contient toutes les informations nécessaires au déroulement du tournoi.</w:t>
+        <w:t>Cette table est propre à chaque tournoi et s’adapte en fonction de la demande de l’organisateur. Elle est générée par un script python</w:t>
+      </w:r>
+      <w:r>
+        <w:t xml:space="preserve"> (dbmanager.py que nous évoquerons en détail dans la phase 2 du projet)</w:t>
+      </w:r>
+      <w:r>
+        <w:t xml:space="preserve"> pour chaque tournoi. Elle contient toutes les informations nécessaires au déroulement du tournoi.</w:t>
       </w:r>
     </w:p>
     <w:p>
@@ -204,11 +264,25 @@
         <w:pStyle w:val="Titre3"/>
       </w:pPr>
       <w:r>
-        <w:lastRenderedPageBreak/>
         <w:t>Contraintes techniques et fonctionnelles</w:t>
       </w:r>
     </w:p>
     <w:p>
+      <w:r>
+        <w:t>Cette base de données doit être ultra adaptable afin de répondre au mieux aux demande de l’organisateur. Elle doit se générer automatiquement à partir des paramètres rentrés par l’organisateur.</w:t>
+      </w:r>
+    </w:p>
+    <w:p>
+      <w:r>
+        <w:t xml:space="preserve">Langue : script python générant une base de données en </w:t>
+      </w:r>
+      <w:proofErr w:type="spellStart"/>
+      <w:r>
+        <w:t>sqlLite</w:t>
+      </w:r>
+      <w:proofErr w:type="spellEnd"/>
+    </w:p>
+    <w:p>
       <w:pPr>
         <w:pStyle w:val="Titre3"/>
       </w:pPr>
@@ -218,6 +292,14 @@
     </w:p>
     <w:p>
       <w:r>
+        <w:t>Schéma général de la base de données</w:t>
+      </w:r>
+    </w:p>
+    <w:p>
+      <w:r>
+        <w:rPr>
+          <w:noProof/>
+        </w:rPr>
         <w:drawing>
           <wp:inline distT="0" distB="0" distL="0" distR="0" wp14:anchorId="1F00D102" wp14:editId="01C4EEA1">
             <wp:extent cx="5760720" cy="3268345"/>
@@ -234,7 +316,7 @@
                     <pic:cNvPicPr/>
                   </pic:nvPicPr>
                   <pic:blipFill>
-                    <a:blip r:embed="rId6"/>
+                    <a:blip r:embed="rId7"/>
                     <a:stretch>
                       <a:fillRect/>
                     </a:stretch>
@@ -261,6 +343,629 @@
       </w:pPr>
       <w:r>
         <w:t>Architecture logicielle et matérielle</w:t>
+      </w:r>
+    </w:p>
+    <w:p>
+      <w:pPr>
+        <w:rPr>
+          <w:lang w:val="en-US"/>
+        </w:rPr>
+      </w:pPr>
+      <w:r>
+        <w:rPr>
+          <w:lang w:val="en-US"/>
+        </w:rPr>
+        <w:t xml:space="preserve">-- </w:t>
+      </w:r>
+      <w:proofErr w:type="gramStart"/>
+      <w:r>
+        <w:rPr>
+          <w:lang w:val="en-US"/>
+        </w:rPr>
+        <w:t>Tableau :</w:t>
+      </w:r>
+      <w:proofErr w:type="gramEnd"/>
+      <w:r>
+        <w:rPr>
+          <w:lang w:val="en-US"/>
+        </w:rPr>
+        <w:t xml:space="preserve"> fields</w:t>
+      </w:r>
+    </w:p>
+    <w:p>
+      <w:pPr>
+        <w:rPr>
+          <w:lang w:val="en-US"/>
+        </w:rPr>
+      </w:pPr>
+      <w:r>
+        <w:rPr>
+          <w:lang w:val="en-US"/>
+        </w:rPr>
+        <w:t>CREATE TABLE fields (</w:t>
+      </w:r>
+      <w:proofErr w:type="spellStart"/>
+      <w:r>
+        <w:rPr>
+          <w:lang w:val="en-US"/>
+        </w:rPr>
+        <w:t>fieldName</w:t>
+      </w:r>
+      <w:proofErr w:type="spellEnd"/>
+      <w:r>
+        <w:rPr>
+          <w:lang w:val="en-US"/>
+        </w:rPr>
+        <w:t xml:space="preserve"> </w:t>
+      </w:r>
+      <w:proofErr w:type="gramStart"/>
+      <w:r>
+        <w:rPr>
+          <w:lang w:val="en-US"/>
+        </w:rPr>
+        <w:t>VARCHAR(</w:t>
+      </w:r>
+      <w:proofErr w:type="gramEnd"/>
+      <w:r>
+        <w:rPr>
+          <w:lang w:val="en-US"/>
+        </w:rPr>
+        <w:t>50) PRIMARY KEY</w:t>
+      </w:r>
+      <w:proofErr w:type="gramStart"/>
+      <w:r>
+        <w:rPr>
+          <w:lang w:val="en-US"/>
+        </w:rPr>
+        <w:t>);</w:t>
+      </w:r>
+      <w:proofErr w:type="gramEnd"/>
+    </w:p>
+    <w:p>
+      <w:pPr>
+        <w:rPr>
+          <w:lang w:val="en-US"/>
+        </w:rPr>
+      </w:pPr>
+      <w:r>
+        <w:rPr>
+          <w:lang w:val="en-US"/>
+        </w:rPr>
+        <w:t xml:space="preserve">-- </w:t>
+      </w:r>
+      <w:proofErr w:type="gramStart"/>
+      <w:r>
+        <w:rPr>
+          <w:lang w:val="en-US"/>
+        </w:rPr>
+        <w:t>Tableau :</w:t>
+      </w:r>
+      <w:proofErr w:type="gramEnd"/>
+      <w:r>
+        <w:rPr>
+          <w:lang w:val="en-US"/>
+        </w:rPr>
+        <w:t xml:space="preserve"> matches</w:t>
+      </w:r>
+    </w:p>
+    <w:p>
+      <w:pPr>
+        <w:rPr>
+          <w:lang w:val="en-US"/>
+        </w:rPr>
+      </w:pPr>
+      <w:r>
+        <w:rPr>
+          <w:lang w:val="en-US"/>
+        </w:rPr>
+        <w:t>CREATE TABLE matches (</w:t>
+      </w:r>
+      <w:proofErr w:type="spellStart"/>
+      <w:r>
+        <w:rPr>
+          <w:lang w:val="en-US"/>
+        </w:rPr>
+        <w:t>matchId</w:t>
+      </w:r>
+      <w:proofErr w:type="spellEnd"/>
+      <w:r>
+        <w:rPr>
+          <w:lang w:val="en-US"/>
+        </w:rPr>
+        <w:t xml:space="preserve"> INTEGER PRIMARY KEY AUTOINCREMENT, </w:t>
+      </w:r>
+      <w:proofErr w:type="spellStart"/>
+      <w:r>
+        <w:rPr>
+          <w:lang w:val="en-US"/>
+        </w:rPr>
+        <w:t>matchDate</w:t>
+      </w:r>
+      <w:proofErr w:type="spellEnd"/>
+      <w:r>
+        <w:rPr>
+          <w:lang w:val="en-US"/>
+        </w:rPr>
+        <w:t xml:space="preserve"> DATETIME, </w:t>
+      </w:r>
+      <w:proofErr w:type="spellStart"/>
+      <w:r>
+        <w:rPr>
+          <w:lang w:val="en-US"/>
+        </w:rPr>
+        <w:t>matchFieldId</w:t>
+      </w:r>
+      <w:proofErr w:type="spellEnd"/>
+      <w:r>
+        <w:rPr>
+          <w:lang w:val="en-US"/>
+        </w:rPr>
+        <w:t xml:space="preserve"> VARCHAR (50) REFERENCES fields (</w:t>
+      </w:r>
+      <w:proofErr w:type="spellStart"/>
+      <w:r>
+        <w:rPr>
+          <w:lang w:val="en-US"/>
+        </w:rPr>
+        <w:t>fieldName</w:t>
+      </w:r>
+      <w:proofErr w:type="spellEnd"/>
+      <w:r>
+        <w:rPr>
+          <w:lang w:val="en-US"/>
+        </w:rPr>
+        <w:t>), team1Name VARCHAR (50) REFERENCES teams (</w:t>
+      </w:r>
+      <w:proofErr w:type="spellStart"/>
+      <w:r>
+        <w:rPr>
+          <w:lang w:val="en-US"/>
+        </w:rPr>
+        <w:t>teamName</w:t>
+      </w:r>
+      <w:proofErr w:type="spellEnd"/>
+      <w:r>
+        <w:rPr>
+          <w:lang w:val="en-US"/>
+        </w:rPr>
+        <w:t>), team2Name VARCHAR (50) REFERENCES teams (</w:t>
+      </w:r>
+      <w:proofErr w:type="spellStart"/>
+      <w:r>
+        <w:rPr>
+          <w:lang w:val="en-US"/>
+        </w:rPr>
+        <w:t>teamName</w:t>
+      </w:r>
+      <w:proofErr w:type="spellEnd"/>
+      <w:r>
+        <w:rPr>
+          <w:lang w:val="en-US"/>
+        </w:rPr>
+        <w:t>))</w:t>
+      </w:r>
+    </w:p>
+    <w:p>
+      <w:pPr>
+        <w:rPr>
+          <w:lang w:val="en-US"/>
+        </w:rPr>
+      </w:pPr>
+      <w:r>
+        <w:rPr>
+          <w:lang w:val="en-US"/>
+        </w:rPr>
+        <w:t xml:space="preserve">-- </w:t>
+      </w:r>
+      <w:proofErr w:type="gramStart"/>
+      <w:r>
+        <w:rPr>
+          <w:lang w:val="en-US"/>
+        </w:rPr>
+        <w:t>Ta</w:t>
+      </w:r>
+      <w:r>
+        <w:rPr>
+          <w:lang w:val="en-US"/>
+        </w:rPr>
+        <w:t>b</w:t>
+      </w:r>
+      <w:r>
+        <w:rPr>
+          <w:lang w:val="en-US"/>
+        </w:rPr>
+        <w:t>leau :</w:t>
+      </w:r>
+      <w:proofErr w:type="gramEnd"/>
+      <w:r>
+        <w:rPr>
+          <w:lang w:val="en-US"/>
+        </w:rPr>
+        <w:t xml:space="preserve"> players</w:t>
+      </w:r>
+    </w:p>
+    <w:p>
+      <w:pPr>
+        <w:rPr>
+          <w:lang w:val="en-US"/>
+        </w:rPr>
+      </w:pPr>
+      <w:r>
+        <w:rPr>
+          <w:lang w:val="en-US"/>
+        </w:rPr>
+        <w:t>CREATE TABLE players (</w:t>
+      </w:r>
+      <w:proofErr w:type="spellStart"/>
+      <w:r>
+        <w:rPr>
+          <w:lang w:val="en-US"/>
+        </w:rPr>
+        <w:t>playerId</w:t>
+      </w:r>
+      <w:proofErr w:type="spellEnd"/>
+      <w:r>
+        <w:rPr>
+          <w:lang w:val="en-US"/>
+        </w:rPr>
+        <w:t xml:space="preserve"> INTEGER PRIMARY KEY, </w:t>
+      </w:r>
+      <w:proofErr w:type="spellStart"/>
+      <w:r>
+        <w:rPr>
+          <w:lang w:val="en-US"/>
+        </w:rPr>
+        <w:t>playerName</w:t>
+      </w:r>
+      <w:proofErr w:type="spellEnd"/>
+      <w:r>
+        <w:rPr>
+          <w:lang w:val="en-US"/>
+        </w:rPr>
+        <w:t xml:space="preserve"> </w:t>
+      </w:r>
+      <w:proofErr w:type="gramStart"/>
+      <w:r>
+        <w:rPr>
+          <w:lang w:val="en-US"/>
+        </w:rPr>
+        <w:t>VARCHAR(</w:t>
+      </w:r>
+      <w:proofErr w:type="gramEnd"/>
+      <w:r>
+        <w:rPr>
+          <w:lang w:val="en-US"/>
+        </w:rPr>
+        <w:t xml:space="preserve">50), </w:t>
+      </w:r>
+      <w:proofErr w:type="spellStart"/>
+      <w:r>
+        <w:rPr>
+          <w:lang w:val="en-US"/>
+        </w:rPr>
+        <w:t>playerFirstName</w:t>
+      </w:r>
+      <w:proofErr w:type="spellEnd"/>
+      <w:r>
+        <w:rPr>
+          <w:lang w:val="en-US"/>
+        </w:rPr>
+        <w:t xml:space="preserve"> </w:t>
+      </w:r>
+      <w:proofErr w:type="gramStart"/>
+      <w:r>
+        <w:rPr>
+          <w:lang w:val="en-US"/>
+        </w:rPr>
+        <w:t>VARCHAR(</w:t>
+      </w:r>
+      <w:proofErr w:type="gramEnd"/>
+      <w:r>
+        <w:rPr>
+          <w:lang w:val="en-US"/>
+        </w:rPr>
+        <w:t xml:space="preserve">20), </w:t>
+      </w:r>
+      <w:proofErr w:type="spellStart"/>
+      <w:r>
+        <w:rPr>
+          <w:lang w:val="en-US"/>
+        </w:rPr>
+        <w:t>playerTeam</w:t>
+      </w:r>
+      <w:proofErr w:type="spellEnd"/>
+      <w:r>
+        <w:rPr>
+          <w:lang w:val="en-US"/>
+        </w:rPr>
+        <w:t xml:space="preserve"> </w:t>
+      </w:r>
+      <w:proofErr w:type="gramStart"/>
+      <w:r>
+        <w:rPr>
+          <w:lang w:val="en-US"/>
+        </w:rPr>
+        <w:t>VARCHAR(</w:t>
+      </w:r>
+      <w:proofErr w:type="gramEnd"/>
+      <w:r>
+        <w:rPr>
+          <w:lang w:val="en-US"/>
+        </w:rPr>
+        <w:t>50) REFERENCES teams(</w:t>
+      </w:r>
+      <w:proofErr w:type="spellStart"/>
+      <w:r>
+        <w:rPr>
+          <w:lang w:val="en-US"/>
+        </w:rPr>
+        <w:t>teamName</w:t>
+      </w:r>
+      <w:proofErr w:type="spellEnd"/>
+      <w:r>
+        <w:rPr>
+          <w:lang w:val="en-US"/>
+        </w:rPr>
+        <w:t xml:space="preserve">), </w:t>
+      </w:r>
+      <w:proofErr w:type="spellStart"/>
+      <w:r>
+        <w:rPr>
+          <w:lang w:val="en-US"/>
+        </w:rPr>
+        <w:t>isTeamChief</w:t>
+      </w:r>
+      <w:proofErr w:type="spellEnd"/>
+      <w:r>
+        <w:rPr>
+          <w:lang w:val="en-US"/>
+        </w:rPr>
+        <w:t xml:space="preserve"> BOOLEAN</w:t>
+      </w:r>
+      <w:proofErr w:type="gramStart"/>
+      <w:r>
+        <w:rPr>
+          <w:lang w:val="en-US"/>
+        </w:rPr>
+        <w:t>);</w:t>
+      </w:r>
+      <w:proofErr w:type="gramEnd"/>
+    </w:p>
+    <w:p>
+      <w:pPr>
+        <w:rPr>
+          <w:lang w:val="en-US"/>
+        </w:rPr>
+      </w:pPr>
+      <w:r>
+        <w:rPr>
+          <w:lang w:val="en-US"/>
+        </w:rPr>
+        <w:t xml:space="preserve">-- </w:t>
+      </w:r>
+      <w:proofErr w:type="gramStart"/>
+      <w:r>
+        <w:rPr>
+          <w:lang w:val="en-US"/>
+        </w:rPr>
+        <w:t>Tableau :</w:t>
+      </w:r>
+      <w:proofErr w:type="gramEnd"/>
+      <w:r>
+        <w:rPr>
+          <w:lang w:val="en-US"/>
+        </w:rPr>
+        <w:t xml:space="preserve"> points</w:t>
+      </w:r>
+    </w:p>
+    <w:p>
+      <w:pPr>
+        <w:rPr>
+          <w:lang w:val="en-US"/>
+        </w:rPr>
+      </w:pPr>
+      <w:r>
+        <w:rPr>
+          <w:lang w:val="en-US"/>
+        </w:rPr>
+        <w:t>CREATE TABLE points (</w:t>
+      </w:r>
+      <w:proofErr w:type="spellStart"/>
+      <w:r>
+        <w:rPr>
+          <w:lang w:val="en-US"/>
+        </w:rPr>
+        <w:t>pointId</w:t>
+      </w:r>
+      <w:proofErr w:type="spellEnd"/>
+      <w:r>
+        <w:rPr>
+          <w:lang w:val="en-US"/>
+        </w:rPr>
+        <w:t xml:space="preserve"> INTEGER PRIMARY KEY AUTOINCREMENT, </w:t>
+      </w:r>
+      <w:proofErr w:type="spellStart"/>
+      <w:r>
+        <w:rPr>
+          <w:lang w:val="en-US"/>
+        </w:rPr>
+        <w:t>matchId</w:t>
+      </w:r>
+      <w:proofErr w:type="spellEnd"/>
+      <w:r>
+        <w:rPr>
+          <w:lang w:val="en-US"/>
+        </w:rPr>
+        <w:t xml:space="preserve"> INTEGER REFERENCES matches (</w:t>
+      </w:r>
+      <w:proofErr w:type="spellStart"/>
+      <w:r>
+        <w:rPr>
+          <w:lang w:val="en-US"/>
+        </w:rPr>
+        <w:t>matchId</w:t>
+      </w:r>
+      <w:proofErr w:type="spellEnd"/>
+      <w:r>
+        <w:rPr>
+          <w:lang w:val="en-US"/>
+        </w:rPr>
+        <w:t xml:space="preserve">), </w:t>
+      </w:r>
+      <w:proofErr w:type="spellStart"/>
+      <w:r>
+        <w:rPr>
+          <w:lang w:val="en-US"/>
+        </w:rPr>
+        <w:t>playerId</w:t>
+      </w:r>
+      <w:proofErr w:type="spellEnd"/>
+      <w:r>
+        <w:rPr>
+          <w:lang w:val="en-US"/>
+        </w:rPr>
+        <w:t xml:space="preserve"> INTEGER REFERENCES players (</w:t>
+      </w:r>
+      <w:proofErr w:type="spellStart"/>
+      <w:r>
+        <w:rPr>
+          <w:lang w:val="en-US"/>
+        </w:rPr>
+        <w:t>playerId</w:t>
+      </w:r>
+      <w:proofErr w:type="spellEnd"/>
+      <w:r>
+        <w:rPr>
+          <w:lang w:val="en-US"/>
+        </w:rPr>
+        <w:t xml:space="preserve">), </w:t>
+      </w:r>
+      <w:proofErr w:type="spellStart"/>
+      <w:r>
+        <w:rPr>
+          <w:lang w:val="en-US"/>
+        </w:rPr>
+        <w:t>numberOfPoints</w:t>
+      </w:r>
+      <w:proofErr w:type="spellEnd"/>
+      <w:r>
+        <w:rPr>
+          <w:lang w:val="en-US"/>
+        </w:rPr>
+        <w:t xml:space="preserve"> INTEGER, team1Scored BOOLEAN, </w:t>
+      </w:r>
+      <w:proofErr w:type="spellStart"/>
+      <w:r>
+        <w:rPr>
+          <w:lang w:val="en-US"/>
+        </w:rPr>
+        <w:t>dateOfPointSubmit</w:t>
+      </w:r>
+      <w:proofErr w:type="spellEnd"/>
+      <w:r>
+        <w:rPr>
+          <w:lang w:val="en-US"/>
+        </w:rPr>
+        <w:t xml:space="preserve"> DATETIME</w:t>
+      </w:r>
+      <w:proofErr w:type="gramStart"/>
+      <w:r>
+        <w:rPr>
+          <w:lang w:val="en-US"/>
+        </w:rPr>
+        <w:t>);</w:t>
+      </w:r>
+      <w:proofErr w:type="gramEnd"/>
+    </w:p>
+    <w:p>
+      <w:pPr>
+        <w:rPr>
+          <w:lang w:val="en-US"/>
+        </w:rPr>
+      </w:pPr>
+      <w:r>
+        <w:rPr>
+          <w:lang w:val="en-US"/>
+        </w:rPr>
+        <w:t xml:space="preserve">-- </w:t>
+      </w:r>
+      <w:proofErr w:type="gramStart"/>
+      <w:r>
+        <w:rPr>
+          <w:lang w:val="en-US"/>
+        </w:rPr>
+        <w:t>Tableau :</w:t>
+      </w:r>
+      <w:proofErr w:type="gramEnd"/>
+      <w:r>
+        <w:rPr>
+          <w:lang w:val="en-US"/>
+        </w:rPr>
+        <w:t xml:space="preserve"> teams</w:t>
+      </w:r>
+    </w:p>
+    <w:p>
+      <w:pPr>
+        <w:rPr>
+          <w:lang w:val="en-US"/>
+        </w:rPr>
+      </w:pPr>
+      <w:r>
+        <w:rPr>
+          <w:lang w:val="en-US"/>
+        </w:rPr>
+        <w:t>CREATE TABLE teams (</w:t>
+      </w:r>
+      <w:proofErr w:type="spellStart"/>
+      <w:r>
+        <w:rPr>
+          <w:lang w:val="en-US"/>
+        </w:rPr>
+        <w:t>teamName</w:t>
+      </w:r>
+      <w:proofErr w:type="spellEnd"/>
+      <w:r>
+        <w:rPr>
+          <w:lang w:val="en-US"/>
+        </w:rPr>
+        <w:t xml:space="preserve"> VARCHAR (50) PRIMARY KEY, </w:t>
+      </w:r>
+      <w:proofErr w:type="spellStart"/>
+      <w:r>
+        <w:rPr>
+          <w:lang w:val="en-US"/>
+        </w:rPr>
+        <w:t>teamPassword</w:t>
+      </w:r>
+      <w:proofErr w:type="spellEnd"/>
+      <w:r>
+        <w:rPr>
+          <w:lang w:val="en-US"/>
+        </w:rPr>
+        <w:t xml:space="preserve"> VARCHAR (20) NOT NULL</w:t>
+      </w:r>
+      <w:proofErr w:type="gramStart"/>
+      <w:r>
+        <w:rPr>
+          <w:lang w:val="en-US"/>
+        </w:rPr>
+        <w:t>);</w:t>
+      </w:r>
+      <w:proofErr w:type="gramEnd"/>
+    </w:p>
+    <w:p>
+      <w:pPr>
+        <w:rPr>
+          <w:lang w:val="en-US"/>
+        </w:rPr>
+      </w:pPr>
+    </w:p>
+    <w:p>
+      <w:pPr>
+        <w:pStyle w:val="Titre3"/>
+      </w:pPr>
+      <w:r>
+        <w:t>Interface utilisateur : Maquettes des écrans, Navigation entre les pages</w:t>
       </w:r>
     </w:p>
     <w:sectPr>
@@ -1298,7 +2003,6 @@
   <w:style w:type="character" w:default="1" w:styleId="Policepardfaut">
     <w:name w:val="Default Paragraph Font"/>
     <w:uiPriority w:val="1"/>
-    <w:semiHidden/>
     <w:unhideWhenUsed/>
   </w:style>
   <w:style w:type="table" w:default="1" w:styleId="TableauNormal">

</xml_diff>